<commit_message>
feat: add v0.2.30 builder terminal benchmark repair
</commit_message>
<xml_diff>
--- a/docs/experiment-status/reports/2026-07-09_1809_E01_plan_first_paid_builder_baseline.docx
+++ b/docs/experiment-status/reports/2026-07-09_1809_E01_plan_first_paid_builder_baseline.docx
@@ -222,14 +222,8 @@
             <w:vAlign w:val="center"/>
           </w:tcPr>
           <w:p>
-            <w:r/>
             <w:r>
-              <w:rPr>
-                <w:rFonts w:ascii="Calibri" w:hAnsi="Calibri" w:eastAsia="Microsoft YaHei"/>
-                <w:b w:val="0"/>
-                <w:sz w:val="20"/>
-              </w:rPr>
-              <w:t>未应用 / 未关闭</w:t>
+              <w:t>已应用（窄修复）/ 原始 A/B 未关闭</w:t>
             </w:r>
           </w:p>
         </w:tc>
@@ -522,6 +516,78 @@
           <w:sz w:val="22"/>
         </w:rPr>
         <w:t>Focused deterministic verification: 4 passed, 1 warning</w:t>
+      </w:r>
+    </w:p>
+    <w:p>
+      <w:pPr>
+        <w:pStyle w:val="Heading1"/>
+      </w:pPr>
+      <w:r>
+        <w:rPr>
+          <w:rFonts w:ascii="Calibri" w:hAnsi="Calibri" w:eastAsia="Microsoft YaHei"/>
+          <w:color w:val="2E74B5"/>
+        </w:rPr>
+        <w:t>工程应用补充</w:t>
+      </w:r>
+    </w:p>
+    <w:p>
+      <w:pPr>
+        <w:spacing w:after="120" w:line="300" w:lineRule="auto"/>
+      </w:pPr>
+      <w:r>
+        <w:rPr>
+          <w:rFonts w:ascii="Calibri" w:hAnsi="Calibri" w:eastAsia="Microsoft YaHei"/>
+          <w:sz w:val="22"/>
+        </w:rPr>
+        <w:t>应用阶段：v0.2.30_builder_terminal_node_repair。该阶段没有把 E01 原始 A/B 实验关闭，而是只应用本报告中暴露的一个窄问题：BuilderBenchmark 把运行时合法的 answer terminal 判为缺少 end。</w:t>
+      </w:r>
+    </w:p>
+    <w:p>
+      <w:pPr>
+        <w:spacing w:after="120" w:line="300" w:lineRule="auto"/>
+      </w:pPr>
+      <w:r>
+        <w:rPr>
+          <w:rFonts w:ascii="Calibri" w:hAnsi="Calibri" w:eastAsia="Microsoft YaHei"/>
+          <w:sz w:val="22"/>
+        </w:rPr>
+        <w:t>工程改动：platform/backend/src/agent_platform/builder_benchmark.py 增加默认节点类型等价 end -&gt; answer；tests/test_workflow.py 增加 API 级回归测试 test_builder_benchmark_treats_answer_as_terminal_end_equivalent。</w:t>
+      </w:r>
+    </w:p>
+    <w:p>
+      <w:pPr>
+        <w:spacing w:after="120" w:line="300" w:lineRule="auto"/>
+      </w:pPr>
+      <w:r>
+        <w:rPr>
+          <w:rFonts w:ascii="Calibri" w:hAnsi="Calibri" w:eastAsia="Microsoft YaHei"/>
+          <w:sz w:val="22"/>
+        </w:rPr>
+        <w:t>验证证据：focused equivalence tests 2 passed；全量后端测试 86 passed；复用 v0.2.29 paid result 的 recheck JSON 显示 benchmark_passed=true、score=0.85、pass_rate=1.0、missing.node_types=[]。</w:t>
+      </w:r>
+    </w:p>
+    <w:p>
+      <w:pPr>
+        <w:spacing w:after="120" w:line="300" w:lineRule="auto"/>
+      </w:pPr>
+      <w:r>
+        <w:rPr>
+          <w:rFonts w:ascii="Calibri" w:hAnsi="Calibri" w:eastAsia="Microsoft YaHei"/>
+          <w:sz w:val="22"/>
+        </w:rPr>
+        <w:t>剩余边界：旧 build 仍为 needs_attention。该应用只修复 benchmark 图结构覆盖的 false-negative，不证明 plan-first 优于 node-by-node，也不证明 Builder 输出字段契约已经满足 summary。</w:t>
+      </w:r>
+    </w:p>
+    <w:p>
+      <w:pPr>
+        <w:spacing w:after="120" w:line="300" w:lineRule="auto"/>
+      </w:pPr>
+      <w:r>
+        <w:rPr>
+          <w:rFonts w:ascii="Calibri" w:hAnsi="Calibri" w:eastAsia="Microsoft YaHei"/>
+          <w:sz w:val="22"/>
+        </w:rPr>
+        <w:t>补充证据：docs/experiment-status/evidence/experiment_v0.2.30_terminal_node_recheck_2026_07_09.json。</w:t>
       </w:r>
     </w:p>
     <w:sectPr>

</xml_diff>

<commit_message>
feat: add v0.2.31 builder repair confirmation
</commit_message>
<xml_diff>
--- a/docs/experiment-status/reports/2026-07-09_1809_E01_plan_first_paid_builder_baseline.docx
+++ b/docs/experiment-status/reports/2026-07-09_1809_E01_plan_first_paid_builder_baseline.docx
@@ -590,6 +590,90 @@
         <w:t>补充证据：docs/experiment-status/evidence/experiment_v0.2.30_terminal_node_recheck_2026_07_09.json。</w:t>
       </w:r>
     </w:p>
+    <w:p>
+      <w:pPr>
+        <w:pStyle w:val="Heading1"/>
+      </w:pPr>
+      <w:r>
+        <w:rPr>
+          <w:rFonts w:ascii="Calibri" w:hAnsi="Calibri" w:eastAsia="Microsoft YaHei"/>
+          <w:color w:val="2E74B5"/>
+        </w:rPr>
+        <w:t>v0.2.31 repair confirmation supplement</w:t>
+      </w:r>
+    </w:p>
+    <w:p>
+      <w:pPr>
+        <w:spacing w:after="120" w:line="300" w:lineRule="auto"/>
+      </w:pPr>
+      <w:r>
+        <w:rPr>
+          <w:rFonts w:ascii="Calibri" w:hAnsi="Calibri" w:eastAsia="Microsoft YaHei"/>
+          <w:sz w:val="22"/>
+        </w:rPr>
+        <w:t>应用阶段：v0.2.31_builder_repair_confirmation。该阶段定位到 v0.2.29 paid run 的另一处闭环问题：第一次 test_run 失败后，Builder 修正测试到新 revision，但 max_repair_cycles=1 阻止确认性 test_run。</w:t>
+      </w:r>
+    </w:p>
+    <w:p>
+      <w:pPr>
+        <w:spacing w:after="120" w:line="300" w:lineRule="auto"/>
+      </w:pPr>
+      <w:r>
+        <w:rPr>
+          <w:rFonts w:ascii="Calibri" w:hAnsi="Calibri" w:eastAsia="Microsoft YaHei"/>
+          <w:sz w:val="22"/>
+        </w:rPr>
+        <w:t>工程改动：BuildTeamState 增加 last_failed_test_revision；Builder test_run 只阻止同一失败 revision 的重复测试，允许 draft/test 修改后的确认测试。</w:t>
+      </w:r>
+    </w:p>
+    <w:p>
+      <w:pPr>
+        <w:spacing w:after="120" w:line="300" w:lineRule="auto"/>
+      </w:pPr>
+      <w:r>
+        <w:rPr>
+          <w:rFonts w:ascii="Calibri" w:hAnsi="Calibri" w:eastAsia="Microsoft YaHei"/>
+          <w:sz w:val="22"/>
+        </w:rPr>
+        <w:t>确定性验证：新增 test_builder_allows_confirmation_test_after_repair_revision；Builder focused group 3 passed；全量后端测试 87 passed；compileall passed。</w:t>
+      </w:r>
+    </w:p>
+    <w:p>
+      <w:pPr>
+        <w:spacing w:after="120" w:line="300" w:lineRule="auto"/>
+      </w:pPr>
+      <w:r>
+        <w:rPr>
+          <w:rFonts w:ascii="Calibri" w:hAnsi="Calibri" w:eastAsia="Microsoft YaHei"/>
+          <w:sz w:val="22"/>
+        </w:rPr>
+        <w:t>paid/live 验证：同一摘要 BlockFlow 需求 fresh rerun 后 build_status=ready，benchmark_passed=true，score=0.85，pass_rate=1.0，missing node types 为空；模型调用 20 次、工具调用 44 次。</w:t>
+      </w:r>
+    </w:p>
+    <w:p>
+      <w:pPr>
+        <w:spacing w:after="120" w:line="300" w:lineRule="auto"/>
+      </w:pPr>
+      <w:r>
+        <w:rPr>
+          <w:rFonts w:ascii="Calibri" w:hAnsi="Calibri" w:eastAsia="Microsoft YaHei"/>
+          <w:sz w:val="22"/>
+        </w:rPr>
+        <w:t>边界：该结果说明 v0.2.29 发现的问题已经被工程应用并通过同类 paid/live smoke 验证；但 E01 的 plan-first vs node-by-node A/B 仍未关闭。</w:t>
+      </w:r>
+    </w:p>
+    <w:p>
+      <w:pPr>
+        <w:spacing w:after="120" w:line="300" w:lineRule="auto"/>
+      </w:pPr>
+      <w:r>
+        <w:rPr>
+          <w:rFonts w:ascii="Calibri" w:hAnsi="Calibri" w:eastAsia="Microsoft YaHei"/>
+          <w:sz w:val="22"/>
+        </w:rPr>
+        <w:t>补充证据：docs/experiment-status/evidence/experiment_v0.2.31_paid_builder_repair_confirmation_2026_07_09.json；docs/experiment-status/evidence/experiment_v0.2.31_repair_confirmation_summary_2026_07_09.json。</w:t>
+      </w:r>
+    </w:p>
     <w:sectPr>
       <w:pgSz w:w="12240" w:h="15840"/>
       <w:pgMar w:top="1440" w:right="1440" w:bottom="1440" w:left="1440" w:header="720" w:footer="720" w:gutter="0"/>

</xml_diff>